<commit_message>
Make printing guide standalone
</commit_message>
<xml_diff>
--- a/docs/MIE_446_3D_Printing_Quick_Start_Guide_Fall_2026.docx
+++ b/docs/MIE_446_3D_Printing_Quick_Start_Guide_Fall_2026.docx
@@ -7039,7 +7039,7 @@
             <w:u w:val="single"/>
             <w:sz w:val="19"/>
           </w:rPr>
-          <w:t>Successful July 2026 G-code — inspection example only</w:t>
+          <w:t>Reference K2 Pro G-code — inspection only; do not print</w:t>
         </w:r>
       </w:hyperlink>
     </w:p>
@@ -7094,7 +7094,7 @@
           <w:color w:val="555555"/>
           <w:sz w:val="18"/>
         </w:rPr>
-        <w:t>Department basis: successful July 2026 OrcaSlicer 2.4.2 / Creality K2 Pro files; Creality K2 Pro + CFS Student Quick-Start Guide; MIE Print and Inspection Lab Rules &amp; Use Agreement; MIE 446 course project guidance. Canvas, lab signage, staff instructions, and machine-specific SOPs supersede this summary when updated. Information verified September 8, 2026.</w:t>
+        <w:t>Scope and authority: this course guide supplements the Creality K2 Pro + CFS machine documentation, MIE Print and Inspection Lab Rules &amp; Use Agreement, and MIE 446 project requirements. Canvas, lab signage, staff instructions, and machine-specific SOPs supersede this summary when updated.</w:t>
       </w:r>
     </w:p>
     <w:sectPr>

</xml_diff>